<commit_message>
@ The county contract names its fifth member
Chapter 7 enumerated county.fips, county.name, county.rucc and county.source
and stopped, so the per-address urban marker that 5.2.15 stamps and that
EPIC-006-F-025-S-002-REQ-B-005 requires appeared in the process chapter and
nowhere in the contract.

It is named now, with its absence semantics: true where the RUCC is 1, 2 or 3,
absent and never false where the address resolved no RUCC, because the panel
renders an unplaced address with a county name and no marker.

The entry also records that ProviderRecordSchema closes the county object to
the other four and must admit this one. The schema contradicts both the
contract and the requirement today.

Co-Authored-By: Claude Opus 5 <noreply@anthropic.com>
@
</commit_message>
<xml_diff>
--- a/pipeline/ArchitectureDesignAndAudit/ProviderPipeline_LowLevelDesign_v48.docx
+++ b/pipeline/ArchitectureDesignAndAudit/ProviderPipeline_LowLevelDesign_v48.docx
@@ -11058,6 +11058,15 @@
           <w:color w:val="008000"/>
         </w:rPr>
         <w:t xml:space="preserve">  - practice_addresses[].county.name — now populated on every stamped county across stages 1/2/3/4. Stage 1 pulls from Census 2020 NAMELSAD_COUNTY_20; stage 2 and stage 3's Census retry resolve via a fips_to_name reverse index built from the crosswalk; stage 4 receives it from Google Maps' administrative_area_level_2 long_name. Prior revision persisted only county.fips.</w:t>
+      </w:r>
+    </w:p>
+    <w:p>
+      <w:pPr/>
+      <w:r>
+        <w:rPr>
+          <w:color w:val="003399"/>
+        </w:rPr>
+        <w:t xml:space="preserve">  - practice_addresses[].county.urban - the per-address marker, derived from that address's own county.rucc by the urban_flag step (5.2.15) and required by EPIC-006-F-025-S-002-REQ-B-005. True where the RUCC is 1, 2 or 3. Absent, never false, where the address resolved no RUCC: the Provider Detail panel renders that address with a county name and no marker. It is a fifth member of the county object alongside fips, name, source and rucc, and ProviderRecordSchema MUST admit it -- the schema closes the county object to the other four today, which contradicts both this contract and the requirement.</w:t>
       </w:r>
     </w:p>
     <w:p>

</xml_diff>